<commit_message>
Proposal v2: add objectives, RQs, method, 80-hour plan, contingency, reporting and AI-use sections
Co-Authored-By: Claude Sonnet 5.5 <noreply@anthropic.com>
Claude-Session: https://claude.ai/code/session_01GombZzS9LLYVmModBqfL5P
</commit_message>
<xml_diff>
--- a/CIS Proposal - AI in Indian Grocery Retail Supply Chain.docx
+++ b/CIS Proposal - AI in Indian Grocery Retail Supply Chain.docx
@@ -35,7 +35,7 @@
           <w:i/>
           <w:sz w:val="19"/>
         </w:rPr>
-        <w:t xml:space="preserve">Yash Goyal -PPM-022-159 | Faculty mentor: Prof. Abhishek Jha | Status: revised topic proposal for approval, 7 Oct 2026</w:t>
+        <w:t>Yash Goyal | PPM-022-159 | Faculty mentor: Prof. Abhishek Jha | Status: revised topic proposal for approval, 7 Oct 2026 (v2)</w:t>
       </w:r>
     </w:p>
     <w:p>
@@ -43,7 +43,7 @@
         <w:pStyle w:val="Heading1"/>
       </w:pPr>
       <w:r>
-        <w:t xml:space="preserve">1. Topic and what the study will do</w:t>
+        <w:t>1. Topic and what the study will do</w:t>
       </w:r>
     </w:p>
     <w:p>
@@ -88,7 +88,112 @@
         <w:pStyle w:val="Heading1"/>
       </w:pPr>
       <w:r>
-        <w:t xml:space="preserve">2. End-to-end grocery retail and supply chain workflow (working framework)</w:t>
+        <w:t>2. Objectives and research questions</w:t>
+      </w:r>
+    </w:p>
+    <w:p>
+      <w:r>
+        <w:t>The objectives build on each other: 1 feeds 2 and 3, which feed 4, which feeds 5. Objective 5 is only as strong as the evidence behind 2 to 4.</w:t>
+      </w:r>
+    </w:p>
+    <w:p>
+      <w:pPr>
+        <w:pStyle w:val="ListBullet"/>
+        <w:spacing w:after="40"/>
+      </w:pPr>
+      <w:r>
+        <w:t>Objective 1. Map the grocery retail and supply chain workflow into stages and sub-steps, and show how it runs today in supermarkets and in quick commerce.</w:t>
+      </w:r>
+    </w:p>
+    <w:p>
+      <w:pPr>
+        <w:pStyle w:val="ListBullet"/>
+        <w:spacing w:after="40"/>
+      </w:pPr>
+      <w:r>
+        <w:t>Objective 2. For the focus stages (forecasting and replenishment, dark-store and DC operations, last mile), document what AI is used for, by whom and at what scale, using only verified sources, each tagged with an evidence grade (A original document, B primary seen through a summary, C press or vendor, X unverified and not cited).</w:t>
+      </w:r>
+    </w:p>
+    <w:p>
+      <w:pPr>
+        <w:pStyle w:val="ListBullet"/>
+        <w:spacing w:after="40"/>
+      </w:pPr>
+      <w:r>
+        <w:t>Objective 3. Record, stage by stage, which outcomes (forecast accuracy, availability, wastage, cost per order) are disclosed and which only activity is disclosed.</w:t>
+      </w:r>
+    </w:p>
+    <w:p>
+      <w:pPr>
+        <w:pStyle w:val="ListBullet"/>
+        <w:spacing w:after="40"/>
+      </w:pPr>
+      <w:r>
+        <w:t>Objective 4. Separate adoption gaps (a source shows the capability absent) from disclosure gaps (no source either way).</w:t>
+      </w:r>
+    </w:p>
+    <w:p>
+      <w:pPr>
+        <w:pStyle w:val="ListBullet"/>
+        <w:spacing w:after="40"/>
+      </w:pPr>
+      <w:r>
+        <w:t>Objective 5. Propose three AI improvements as testable hypotheses: what, why, data needed, risk, regulatory fit and how to measure.</w:t>
+      </w:r>
+    </w:p>
+    <w:p>
+      <w:pPr>
+        <w:spacing w:after="40"/>
+      </w:pPr>
+      <w:r>
+        <w:rPr>
+          <w:b/>
+        </w:rPr>
+        <w:t>Research questions:</w:t>
+      </w:r>
+    </w:p>
+    <w:p>
+      <w:pPr>
+        <w:pStyle w:val="ListBullet"/>
+        <w:spacing w:after="40"/>
+      </w:pPr>
+      <w:r>
+        <w:t>RQ1. At each focus stage, which AI uses at Indian grocers and quick-commerce firms are documented, and at what scale?</w:t>
+      </w:r>
+    </w:p>
+    <w:p>
+      <w:pPr>
+        <w:pStyle w:val="ListBullet"/>
+        <w:spacing w:after="40"/>
+      </w:pPr>
+      <w:r>
+        <w:t>RQ2. Where are outcomes disclosed, and where only activity?</w:t>
+      </w:r>
+    </w:p>
+    <w:p>
+      <w:pPr>
+        <w:pStyle w:val="ListBullet"/>
+        <w:spacing w:after="40"/>
+      </w:pPr>
+      <w:r>
+        <w:t>RQ3. Which gaps are adoption gaps and which are disclosure gaps, and what do practitioners say about the difference?</w:t>
+      </w:r>
+    </w:p>
+    <w:p>
+      <w:pPr>
+        <w:pStyle w:val="ListBullet"/>
+        <w:spacing w:after="40"/>
+      </w:pPr>
+      <w:r>
+        <w:t>RQ4. Which three improvements are most defensible given the evidence and the regulation (FSSAI, FDI rules on inventory, DPDP)?</w:t>
+      </w:r>
+    </w:p>
+    <w:p>
+      <w:pPr>
+        <w:pStyle w:val="Heading1"/>
+      </w:pPr>
+      <w:r>
+        <w:t>3. End-to-end grocery retail and supply chain workflow (working framework)</w:t>
       </w:r>
     </w:p>
     <w:p>
@@ -669,7 +774,7 @@
         <w:pStyle w:val="Heading1"/>
       </w:pPr>
       <w:r>
-        <w:t xml:space="preserve">3. Where AI is used today: verified examples by stage</w:t>
+        <w:t>4. Where AI is used today: verified examples by stage</w:t>
       </w:r>
     </w:p>
     <w:p>
@@ -1250,7 +1355,7 @@
         <w:pStyle w:val="Heading1"/>
       </w:pPr>
       <w:r>
-        <w:t xml:space="preserve">4. Gap observed and focus of the study</w:t>
+        <w:t>5. Gap observed and focus of the study</w:t>
       </w:r>
     </w:p>
     <w:p>
@@ -1310,7 +1415,7 @@
         <w:pStyle w:val="Heading1"/>
       </w:pPr>
       <w:r>
-        <w:t xml:space="preserve">5. Potential AI improvements to develop (hypotheses, not findings)</w:t>
+        <w:t>6. Potential AI improvements to develop (hypotheses, not findings)</w:t>
       </w:r>
     </w:p>
     <w:p>
@@ -1359,7 +1464,768 @@
         <w:pStyle w:val="Heading1"/>
       </w:pPr>
       <w:r>
-        <w:t xml:space="preserve">6. Limitations and points for your guidance</w:t>
+        <w:t>7. Method and primary data</w:t>
+      </w:r>
+    </w:p>
+    <w:p>
+      <w:pPr>
+        <w:pStyle w:val="ListBullet"/>
+        <w:spacing w:after="40"/>
+      </w:pPr>
+      <w:r>
+        <w:t>Design: desk-based empirical study (structured document analysis plus gap analysis), supported by practitioner interviews. It is not a statistical test, and no causal claims are made.</w:t>
+      </w:r>
+    </w:p>
+    <w:p>
+      <w:pPr>
+        <w:pStyle w:val="ListBullet"/>
+        <w:spacing w:after="40"/>
+      </w:pPr>
+      <w:r>
+        <w:t>Sources: annual reports, investor letters, earnings-call transcripts, prospectuses and regulator texts for any figure. Press, vendor and consulting material is used only to locate leads and is labelled grade C or X.</w:t>
+      </w:r>
+    </w:p>
+    <w:p>
+      <w:pPr>
+        <w:pStyle w:val="ListBullet"/>
+        <w:spacing w:after="40"/>
+      </w:pPr>
+      <w:r>
+        <w:t>Disclosure matrix: a company-by-stage grid recording whether each of activity, scale, cost and outcome is disclosed. It is the main tool for RQ2 and RQ3.</w:t>
+      </w:r>
+    </w:p>
+    <w:p>
+      <w:pPr>
+        <w:pStyle w:val="ListBullet"/>
+        <w:spacing w:after="40"/>
+      </w:pPr>
+      <w:r>
+        <w:t>Gap test: a gap is called an adoption gap only if a source shows the capability absent; otherwise it is a disclosure gap.</w:t>
+      </w:r>
+    </w:p>
+    <w:p>
+      <w:pPr>
+        <w:pStyle w:val="ListBullet"/>
+        <w:spacing w:after="40"/>
+      </w:pPr>
+      <w:r>
+        <w:t>Interviews: 3 to 4 semi-structured interviews of about 30 minutes with retail planners, category or supply-chain managers, or quick-commerce operations staff, to cover what filings do not. Participants are anonymised, consent is taken before recording or notes, and interview material is labelled as practitioner opinion, not audited fact.</w:t>
+      </w:r>
+    </w:p>
+    <w:p>
+      <w:pPr>
+        <w:pStyle w:val="ListBullet"/>
+        <w:spacing w:after="40"/>
+      </w:pPr>
+      <w:r>
+        <w:t>Verification rule: before a figure enters the report, the original document is opened and the document, date and page recorded.</w:t>
+      </w:r>
+    </w:p>
+    <w:p>
+      <w:pPr>
+        <w:pStyle w:val="Heading1"/>
+      </w:pPr>
+      <w:r>
+        <w:t>8. Deliverables and 80-hour plan</w:t>
+      </w:r>
+    </w:p>
+    <w:p>
+      <w:r>
+        <w:t>Deliverables: evidence register; stage analyses; disclosure matrix; three proposal one-pagers; regulatory table; interview summary; final report with limitations; seminar slides; AI-usage log (appendix).</w:t>
+      </w:r>
+    </w:p>
+    <w:tbl>
+      <w:tblPr>
+        <w:tblStyle w:val="TableGrid"/>
+        <w:tblW w:w="0" w:type="auto"/>
+        <w:jc w:val="center"/>
+        <w:tblLayout w:type="fixed"/>
+        <w:tblLook w:val="04A0" w:firstRow="1" w:lastRow="0" w:firstColumn="1" w:lastColumn="0" w:noHBand="0" w:noVBand="1"/>
+      </w:tblPr>
+      <w:tblGrid>
+        <w:gridCol w:w="1814"/>
+        <w:gridCol w:w="6406"/>
+        <w:gridCol w:w="1531"/>
+      </w:tblGrid>
+      <w:tr>
+        <w:trPr>
+          <w:tblHeader/>
+          <w:jc w:val="center"/>
+        </w:trPr>
+        <w:tc>
+          <w:tcPr>
+            <w:tcW w:w="1814" w:type="dxa"/>
+            <w:shd w:val="clear" w:color="auto" w:fill="1F3A5F"/>
+          </w:tcPr>
+          <w:p>
+            <w:r>
+              <w:rPr>
+                <w:b/>
+                <w:color w:val="FFFFFF"/>
+                <w:sz w:val="18"/>
+              </w:rPr>
+              <w:t>Block</w:t>
+            </w:r>
+          </w:p>
+        </w:tc>
+        <w:tc>
+          <w:tcPr>
+            <w:tcW w:w="6406" w:type="dxa"/>
+            <w:shd w:val="clear" w:color="auto" w:fill="1F3A5F"/>
+          </w:tcPr>
+          <w:p>
+            <w:r>
+              <w:rPr>
+                <w:b/>
+                <w:color w:val="FFFFFF"/>
+                <w:sz w:val="18"/>
+              </w:rPr>
+              <w:t>Work and output</w:t>
+            </w:r>
+          </w:p>
+        </w:tc>
+        <w:tc>
+          <w:tcPr>
+            <w:tcW w:w="1531" w:type="dxa"/>
+            <w:shd w:val="clear" w:color="auto" w:fill="1F3A5F"/>
+          </w:tcPr>
+          <w:p>
+            <w:r>
+              <w:rPr>
+                <w:b/>
+                <w:color w:val="FFFFFF"/>
+                <w:sz w:val="18"/>
+              </w:rPr>
+              <w:t>Hours</w:t>
+            </w:r>
+          </w:p>
+        </w:tc>
+      </w:tr>
+      <w:tr>
+        <w:trPr>
+          <w:jc w:val="center"/>
+        </w:trPr>
+        <w:tc>
+          <w:tcPr>
+            <w:tcW w:w="1814" w:type="dxa"/>
+          </w:tcPr>
+          <w:p>
+            <w:pPr>
+              <w:spacing w:after="0"/>
+            </w:pPr>
+            <w:r>
+              <w:rPr>
+                <w:b/>
+                <w:sz w:val="18"/>
+              </w:rPr>
+              <w:t>1 Workflow and source audit</w:t>
+            </w:r>
+          </w:p>
+        </w:tc>
+        <w:tc>
+          <w:tcPr>
+            <w:tcW w:w="6406" w:type="dxa"/>
+          </w:tcPr>
+          <w:p>
+            <w:pPr>
+              <w:spacing w:after="0"/>
+            </w:pPr>
+            <w:r>
+              <w:rPr>
+                <w:sz w:val="18"/>
+              </w:rPr>
+              <w:t>Finalise workflow map; evidence register with document, date, page and grade for every figure</w:t>
+            </w:r>
+          </w:p>
+        </w:tc>
+        <w:tc>
+          <w:tcPr>
+            <w:tcW w:w="1531" w:type="dxa"/>
+          </w:tcPr>
+          <w:p>
+            <w:pPr>
+              <w:spacing w:after="0"/>
+            </w:pPr>
+            <w:r>
+              <w:rPr>
+                <w:sz w:val="18"/>
+              </w:rPr>
+              <w:t>8</w:t>
+            </w:r>
+          </w:p>
+        </w:tc>
+      </w:tr>
+      <w:tr>
+        <w:trPr>
+          <w:jc w:val="center"/>
+        </w:trPr>
+        <w:tc>
+          <w:tcPr>
+            <w:tcW w:w="1814" w:type="dxa"/>
+          </w:tcPr>
+          <w:p>
+            <w:pPr>
+              <w:spacing w:after="0"/>
+            </w:pPr>
+            <w:r>
+              <w:rPr>
+                <w:b/>
+                <w:sz w:val="18"/>
+              </w:rPr>
+              <w:t>2 Forecasting and replenishment (deepest)</w:t>
+            </w:r>
+          </w:p>
+        </w:tc>
+        <w:tc>
+          <w:tcPr>
+            <w:tcW w:w="6406" w:type="dxa"/>
+          </w:tcPr>
+          <w:p>
+            <w:pPr>
+              <w:spacing w:after="0"/>
+            </w:pPr>
+            <w:r>
+              <w:rPr>
+                <w:sz w:val="18"/>
+              </w:rPr>
+              <w:t>Indian and global cases, More Retail re-read, Zepto DRHP, Flipkart paper; stage analysis</w:t>
+            </w:r>
+          </w:p>
+        </w:tc>
+        <w:tc>
+          <w:tcPr>
+            <w:tcW w:w="1531" w:type="dxa"/>
+          </w:tcPr>
+          <w:p>
+            <w:pPr>
+              <w:spacing w:after="0"/>
+            </w:pPr>
+            <w:r>
+              <w:rPr>
+                <w:sz w:val="18"/>
+              </w:rPr>
+              <w:t>20</w:t>
+            </w:r>
+          </w:p>
+        </w:tc>
+      </w:tr>
+      <w:tr>
+        <w:trPr>
+          <w:jc w:val="center"/>
+        </w:trPr>
+        <w:tc>
+          <w:tcPr>
+            <w:tcW w:w="1814" w:type="dxa"/>
+          </w:tcPr>
+          <w:p>
+            <w:pPr>
+              <w:spacing w:after="0"/>
+            </w:pPr>
+            <w:r>
+              <w:rPr>
+                <w:b/>
+                <w:sz w:val="18"/>
+              </w:rPr>
+              <w:t>3 Dark-store and DC operations, last mile</w:t>
+            </w:r>
+          </w:p>
+        </w:tc>
+        <w:tc>
+          <w:tcPr>
+            <w:tcW w:w="6406" w:type="dxa"/>
+          </w:tcPr>
+          <w:p>
+            <w:pPr>
+              <w:spacing w:after="0"/>
+            </w:pPr>
+            <w:r>
+              <w:rPr>
+                <w:sz w:val="18"/>
+              </w:rPr>
+              <w:t>Disclosure review for Eternal, Swiggy, Reliance, Delhivery, plus comparators; stage analysis</w:t>
+            </w:r>
+          </w:p>
+        </w:tc>
+        <w:tc>
+          <w:tcPr>
+            <w:tcW w:w="1531" w:type="dxa"/>
+          </w:tcPr>
+          <w:p>
+            <w:pPr>
+              <w:spacing w:after="0"/>
+            </w:pPr>
+            <w:r>
+              <w:rPr>
+                <w:sz w:val="18"/>
+              </w:rPr>
+              <w:t>12</w:t>
+            </w:r>
+          </w:p>
+        </w:tc>
+      </w:tr>
+      <w:tr>
+        <w:trPr>
+          <w:jc w:val="center"/>
+        </w:trPr>
+        <w:tc>
+          <w:tcPr>
+            <w:tcW w:w="1814" w:type="dxa"/>
+          </w:tcPr>
+          <w:p>
+            <w:pPr>
+              <w:spacing w:after="0"/>
+            </w:pPr>
+            <w:r>
+              <w:rPr>
+                <w:b/>
+                <w:sz w:val="18"/>
+              </w:rPr>
+              <w:t>4 Gap analysis and hypotheses</w:t>
+            </w:r>
+          </w:p>
+        </w:tc>
+        <w:tc>
+          <w:tcPr>
+            <w:tcW w:w="6406" w:type="dxa"/>
+          </w:tcPr>
+          <w:p>
+            <w:pPr>
+              <w:spacing w:after="0"/>
+            </w:pPr>
+            <w:r>
+              <w:rPr>
+                <w:sz w:val="18"/>
+              </w:rPr>
+              <w:t>Disclosure matrix (company by stage); adoption versus disclosure gap test; three proposal one-pagers</w:t>
+            </w:r>
+          </w:p>
+        </w:tc>
+        <w:tc>
+          <w:tcPr>
+            <w:tcW w:w="1531" w:type="dxa"/>
+          </w:tcPr>
+          <w:p>
+            <w:pPr>
+              <w:spacing w:after="0"/>
+            </w:pPr>
+            <w:r>
+              <w:rPr>
+                <w:sz w:val="18"/>
+              </w:rPr>
+              <w:t>8</w:t>
+            </w:r>
+          </w:p>
+        </w:tc>
+      </w:tr>
+      <w:tr>
+        <w:trPr>
+          <w:jc w:val="center"/>
+        </w:trPr>
+        <w:tc>
+          <w:tcPr>
+            <w:tcW w:w="1814" w:type="dxa"/>
+          </w:tcPr>
+          <w:p>
+            <w:pPr>
+              <w:spacing w:after="0"/>
+            </w:pPr>
+            <w:r>
+              <w:rPr>
+                <w:b/>
+                <w:sz w:val="18"/>
+              </w:rPr>
+              <w:t>5 Practitioner interviews</w:t>
+            </w:r>
+          </w:p>
+        </w:tc>
+        <w:tc>
+          <w:tcPr>
+            <w:tcW w:w="6406" w:type="dxa"/>
+          </w:tcPr>
+          <w:p>
+            <w:pPr>
+              <w:spacing w:after="0"/>
+            </w:pPr>
+            <w:r>
+              <w:rPr>
+                <w:sz w:val="18"/>
+              </w:rPr>
+              <w:t>Guide, 3 to 4 interviews, coding of responses</w:t>
+            </w:r>
+          </w:p>
+        </w:tc>
+        <w:tc>
+          <w:tcPr>
+            <w:tcW w:w="1531" w:type="dxa"/>
+          </w:tcPr>
+          <w:p>
+            <w:pPr>
+              <w:spacing w:after="0"/>
+            </w:pPr>
+            <w:r>
+              <w:rPr>
+                <w:sz w:val="18"/>
+              </w:rPr>
+              <w:t>8</w:t>
+            </w:r>
+          </w:p>
+        </w:tc>
+      </w:tr>
+      <w:tr>
+        <w:trPr>
+          <w:jc w:val="center"/>
+        </w:trPr>
+        <w:tc>
+          <w:tcPr>
+            <w:tcW w:w="1814" w:type="dxa"/>
+          </w:tcPr>
+          <w:p>
+            <w:pPr>
+              <w:spacing w:after="0"/>
+            </w:pPr>
+            <w:r>
+              <w:rPr>
+                <w:b/>
+                <w:sz w:val="18"/>
+              </w:rPr>
+              <w:t>6 Regulatory screen</w:t>
+            </w:r>
+          </w:p>
+        </w:tc>
+        <w:tc>
+          <w:tcPr>
+            <w:tcW w:w="6406" w:type="dxa"/>
+          </w:tcPr>
+          <w:p>
+            <w:pPr>
+              <w:spacing w:after="0"/>
+            </w:pPr>
+            <w:r>
+              <w:rPr>
+                <w:sz w:val="18"/>
+              </w:rPr>
+              <w:t>FSSAI, FDI and IOCC, CCI, DPDP, Legal Metrology read from primary text; regulatory table</w:t>
+            </w:r>
+          </w:p>
+        </w:tc>
+        <w:tc>
+          <w:tcPr>
+            <w:tcW w:w="1531" w:type="dxa"/>
+          </w:tcPr>
+          <w:p>
+            <w:pPr>
+              <w:spacing w:after="0"/>
+            </w:pPr>
+            <w:r>
+              <w:rPr>
+                <w:sz w:val="18"/>
+              </w:rPr>
+              <w:t>5</w:t>
+            </w:r>
+          </w:p>
+        </w:tc>
+      </w:tr>
+      <w:tr>
+        <w:trPr>
+          <w:jc w:val="center"/>
+        </w:trPr>
+        <w:tc>
+          <w:tcPr>
+            <w:tcW w:w="1814" w:type="dxa"/>
+          </w:tcPr>
+          <w:p>
+            <w:pPr>
+              <w:spacing w:after="0"/>
+            </w:pPr>
+            <w:r>
+              <w:rPr>
+                <w:b/>
+                <w:sz w:val="18"/>
+              </w:rPr>
+              <w:t>7 Report and slides</w:t>
+            </w:r>
+          </w:p>
+        </w:tc>
+        <w:tc>
+          <w:tcPr>
+            <w:tcW w:w="6406" w:type="dxa"/>
+          </w:tcPr>
+          <w:p>
+            <w:pPr>
+              <w:spacing w:after="0"/>
+            </w:pPr>
+            <w:r>
+              <w:rPr>
+                <w:sz w:val="18"/>
+              </w:rPr>
+              <w:t>Final report with limitations, defence slides, AI-usage log</w:t>
+            </w:r>
+          </w:p>
+        </w:tc>
+        <w:tc>
+          <w:tcPr>
+            <w:tcW w:w="1531" w:type="dxa"/>
+          </w:tcPr>
+          <w:p>
+            <w:pPr>
+              <w:spacing w:after="0"/>
+            </w:pPr>
+            <w:r>
+              <w:rPr>
+                <w:sz w:val="18"/>
+              </w:rPr>
+              <w:t>15</w:t>
+            </w:r>
+          </w:p>
+        </w:tc>
+      </w:tr>
+      <w:tr>
+        <w:trPr>
+          <w:jc w:val="center"/>
+        </w:trPr>
+        <w:tc>
+          <w:tcPr>
+            <w:tcW w:w="1814" w:type="dxa"/>
+          </w:tcPr>
+          <w:p>
+            <w:pPr>
+              <w:spacing w:after="0"/>
+            </w:pPr>
+            <w:r>
+              <w:rPr>
+                <w:b/>
+                <w:sz w:val="18"/>
+              </w:rPr>
+              <w:t>Buffer</w:t>
+            </w:r>
+          </w:p>
+        </w:tc>
+        <w:tc>
+          <w:tcPr>
+            <w:tcW w:w="6406" w:type="dxa"/>
+          </w:tcPr>
+          <w:p>
+            <w:pPr>
+              <w:spacing w:after="0"/>
+            </w:pPr>
+            <w:r>
+              <w:rPr>
+                <w:sz w:val="18"/>
+              </w:rPr>
+              <w:t>Mentor feedback, source access problems</w:t>
+            </w:r>
+          </w:p>
+        </w:tc>
+        <w:tc>
+          <w:tcPr>
+            <w:tcW w:w="1531" w:type="dxa"/>
+          </w:tcPr>
+          <w:p>
+            <w:pPr>
+              <w:spacing w:after="0"/>
+            </w:pPr>
+            <w:r>
+              <w:rPr>
+                <w:sz w:val="18"/>
+              </w:rPr>
+              <w:t>4</w:t>
+            </w:r>
+          </w:p>
+        </w:tc>
+      </w:tr>
+      <w:tr>
+        <w:trPr>
+          <w:jc w:val="center"/>
+        </w:trPr>
+        <w:tc>
+          <w:tcPr>
+            <w:tcW w:w="1814" w:type="dxa"/>
+          </w:tcPr>
+          <w:p>
+            <w:pPr>
+              <w:spacing w:after="0"/>
+            </w:pPr>
+            <w:r>
+              <w:rPr>
+                <w:b/>
+                <w:sz w:val="18"/>
+              </w:rPr>
+              <w:t>Total</w:t>
+            </w:r>
+          </w:p>
+        </w:tc>
+        <w:tc>
+          <w:tcPr>
+            <w:tcW w:w="6406" w:type="dxa"/>
+          </w:tcPr>
+          <w:p>
+            <w:pPr>
+              <w:spacing w:after="0"/>
+            </w:pPr>
+            <w:r>
+              <w:rPr>
+                <w:sz w:val="18"/>
+              </w:rPr>
+            </w:r>
+          </w:p>
+        </w:tc>
+        <w:tc>
+          <w:tcPr>
+            <w:tcW w:w="1531" w:type="dxa"/>
+          </w:tcPr>
+          <w:p>
+            <w:pPr>
+              <w:spacing w:after="0"/>
+            </w:pPr>
+            <w:r>
+              <w:rPr>
+                <w:sz w:val="18"/>
+              </w:rPr>
+              <w:t>80</w:t>
+            </w:r>
+          </w:p>
+        </w:tc>
+      </w:tr>
+    </w:tbl>
+    <w:p>
+      <w:r>
+        <w:rPr>
+          <w:i/>
+          <w:sz w:val="18"/>
+        </w:rPr>
+        <w:t>Hours are a plan for the 80-hour requirement and will be adjusted with the mentor.</w:t>
+      </w:r>
+    </w:p>
+    <w:p>
+      <w:pPr>
+        <w:pStyle w:val="Heading1"/>
+      </w:pPr>
+      <w:r>
+        <w:t>9. Contingency plan</w:t>
+      </w:r>
+    </w:p>
+    <w:p>
+      <w:pPr>
+        <w:pStyle w:val="ListBullet"/>
+        <w:spacing w:after="40"/>
+      </w:pPr>
+      <w:r>
+        <w:rPr>
+          <w:b/>
+        </w:rPr>
+        <w:t xml:space="preserve">Interviews not secured by week 3: </w:t>
+      </w:r>
+      <w:r>
+        <w:rPr>
+          <w:b w:val="0"/>
+        </w:rPr>
+        <w:t>use the earnings-call transcripts, analyst-call Q&amp;A and published practitioner talks as the primary substitute, and say so in the limitations.</w:t>
+      </w:r>
+    </w:p>
+    <w:p>
+      <w:pPr>
+        <w:pStyle w:val="ListBullet"/>
+        <w:spacing w:after="40"/>
+      </w:pPr>
+      <w:r>
+        <w:rPr>
+          <w:b/>
+        </w:rPr>
+        <w:t xml:space="preserve">Evidence thinner than expected: </w:t>
+      </w:r>
+      <w:r>
+        <w:rPr>
+          <w:b w:val="0"/>
+        </w:rPr>
+        <w:t>narrow to forecasting and replenishment only and shift weight to the disclosure-gap finding, which is itself a result.</w:t>
+      </w:r>
+    </w:p>
+    <w:p>
+      <w:pPr>
+        <w:pStyle w:val="ListBullet"/>
+        <w:spacing w:after="40"/>
+      </w:pPr>
+      <w:r>
+        <w:rPr>
+          <w:b/>
+        </w:rPr>
+        <w:t xml:space="preserve">Mentor expects quantified outcomes for every stage: </w:t>
+      </w:r>
+      <w:r>
+        <w:rPr>
+          <w:b w:val="0"/>
+        </w:rPr>
+        <w:t>build a metric framework (forecast error, in-stock rate, wastage, cost per order) with the More Retail and global comparator figures, clearly labelled as illustrative and not Indian averages.</w:t>
+      </w:r>
+    </w:p>
+    <w:p>
+      <w:pPr>
+        <w:pStyle w:val="ListBullet"/>
+        <w:spacing w:after="40"/>
+      </w:pPr>
+      <w:r>
+        <w:rPr>
+          <w:b/>
+        </w:rPr>
+        <w:t xml:space="preserve">A key source is revised or inaccessible: </w:t>
+      </w:r>
+      <w:r>
+        <w:rPr>
+          <w:b w:val="0"/>
+        </w:rPr>
+        <w:t>keep local copies with access dates and fall back to the nearest comparable filing.</w:t>
+      </w:r>
+    </w:p>
+    <w:p>
+      <w:pPr>
+        <w:pStyle w:val="ListBullet"/>
+        <w:spacing w:after="40"/>
+      </w:pPr>
+      <w:r>
+        <w:rPr>
+          <w:b/>
+        </w:rPr>
+        <w:t xml:space="preserve">Topic not workable overall: </w:t>
+      </w:r>
+      <w:r>
+        <w:rPr>
+          <w:b w:val="0"/>
+        </w:rPr>
+        <w:t>return to the lending study; the verified evidence for it is already compiled.</w:t>
+      </w:r>
+    </w:p>
+    <w:p>
+      <w:pPr>
+        <w:pStyle w:val="Heading1"/>
+      </w:pPr>
+      <w:r>
+        <w:t>10. Reporting rhythm and integrity</w:t>
+      </w:r>
+    </w:p>
+    <w:p>
+      <w:pPr>
+        <w:pStyle w:val="ListBullet"/>
+        <w:spacing w:after="40"/>
+      </w:pPr>
+      <w:r>
+        <w:t>A weekly update to the faculty mentor (email or short meeting) and a mandatory in-person meeting every fortnight, as the course requires.</w:t>
+      </w:r>
+    </w:p>
+    <w:p>
+      <w:pPr>
+        <w:pStyle w:val="ListBullet"/>
+        <w:spacing w:after="40"/>
+      </w:pPr>
+      <w:r>
+        <w:t>All analysis, conclusions and writing will be my own work. Any use of AI tools is limited to what the mentor permits, is recorded in an appendix log, and every figure is checked against its original document. The signed declaration will be submitted with the report.</w:t>
+      </w:r>
+    </w:p>
+    <w:p>
+      <w:pPr>
+        <w:pStyle w:val="Heading1"/>
+      </w:pPr>
+      <w:r>
+        <w:t>11. Limitations and points for your guidance</w:t>
       </w:r>
     </w:p>
     <w:p>
@@ -1405,6 +2271,24 @@
       </w:pPr>
       <w:r>
         <w:t xml:space="preserve">Question 2: should the study centre on supermarket chains, quick commerce, or both? Proposed: both, with forecasting and replenishment as the common thread.</w:t>
+      </w:r>
+    </w:p>
+    <w:p>
+      <w:pPr>
+        <w:pStyle w:val="ListBullet"/>
+        <w:spacing w:after="40"/>
+      </w:pPr>
+      <w:r>
+        <w:t>Question 3: the course outline restricts the use of AI tools. Which uses, if any, are permitted (for example, reading and summarising public documents, with all figures verified against originals and a usage log), and what should the declaration say?</w:t>
+      </w:r>
+    </w:p>
+    <w:p>
+      <w:pPr>
+        <w:pStyle w:val="ListBullet"/>
+        <w:spacing w:after="40"/>
+      </w:pPr>
+      <w:r>
+        <w:t>Question 4: could you suggest any contacts in grocery, quick commerce or retail supply chain for the interviews, or would you support adding a corporate mentor as the outline allows?</w:t>
       </w:r>
     </w:p>
     <w:sectPr>

</xml_diff>

<commit_message>
Proposal: re-check figures against source text, add Trent, Carrefour, Swiggy inventory-led figure, regulatory list
Co-Authored-By: Claude Sonnet 5.5 <noreply@anthropic.com>
Claude-Session: https://claude.ai/code/session_01GombZzS9LLYVmModBqfL5P
</commit_message>
<xml_diff>
--- a/CIS Proposal - AI in Indian Grocery Retail Supply Chain.docx
+++ b/CIS Proposal - AI in Indian Grocery Retail Supply Chain.docx
@@ -936,7 +936,7 @@
               <w:rPr>
                 <w:sz w:val="18"/>
               </w:rPr>
-              <w:t xml:space="preserve">Eternal: demand prediction already uses AI, no metric given (Q4 FY26 letter). More Retail with Ganit: forecast accuracy from 24% to 76%, fresh-produce wastage down by up to 30%, in-stock rate from 80% to 90% and gross profit up 25%, across 600+ supermarkets (AWS blog, Mar 2021, written by the retailer and its vendor). DMart: no AI or machine-learning mention in its FY25 and FY26 annual reports or Aug 2026 call. Spencer's FY26 annual report lists demand forecasting as a roadmap item for Nature's Basket.</w:t>
+              <w:t>Eternal: demand prediction already uses AI, no metric given (Q4 FY26 letter). More Retail with Ganit: forecast accuracy from 24% to 76%, fresh-produce wastage down by up to 30%, in-stock rate from 80% to 90% and gross profit up 25%, across 600+ supermarkets, using Amazon Forecast (AWS blog, Mar 2021, written by the retailer and its analytics vendor). DMart: no AI or machine-learning mention in its FY25 and FY26 annual reports or Aug 2026 call. Spencer's FY26 annual report lists demand forecasting as a roadmap item for Nature's Basket. Trent (owner of the Star grocery format) says AI-led use cases increasingly support demand forecasting and inventory optimisation, but this is group-level and mostly apparel (Annual Report FY26, p9).</w:t>
             </w:r>
           </w:p>
         </w:tc>
@@ -1044,7 +1044,7 @@
               <w:rPr>
                 <w:sz w:val="18"/>
               </w:rPr>
-              <w:t xml:space="preserve">Eternal moved quick commerce to an inventory-ownership model from Q1 FY26 (Q4 FY26 letter). Swiggy expects the inventory-owning (IOCC) route to add about 80 bps to Instamart's contribution margin (Q1 FY27 letter). Both are model changes; neither letter gives an AI metric for replenishment. Walmart says it increasingly uses AI-powered tools for operational efficiency (Annual Report FY26).</w:t>
+              <w:t>Eternal moved quick commerce to an inventory-ownership model from Q1 FY26 (Q4 FY26 letter). Swiggy expects the inventory-owning (IOCC) route to add about 80 bps to Instamart's contribution margin (Q1 FY27 letter), and says an inventory-led operating model could add a further INR 4-5 per order. All of these are model changes; neither letter gives an AI metric for replenishment. Walmart says it increasingly uses AI-powered tools for operational efficiency (Annual Report FY26).</w:t>
             </w:r>
           </w:p>
         </w:tc>
@@ -1098,7 +1098,7 @@
               <w:rPr>
                 <w:sz w:val="18"/>
               </w:rPr>
-              <w:t xml:space="preserve">Eternal: 2,243 Blinkit stores at the end of Q4 FY26, and AI "will not stock shelves in a dark store". Ahold Delhaize says AI contributes to supply chain optimization (Annual Report 2025). No Indian store-level outcome metric found.</w:t>
+              <w:t>Eternal: 2,243 Blinkit stores at the end of Q4 FY26, and AI "will not stock shelves in a dark store". Ahold Delhaize says AI contributes to supply chain optimization (Annual Report 2025). Carrefour's 2030 plan describes shelf cameras (Captana) that detect out-of-stocks and price errors, a global comparator with no outcome figures. No Indian store-level outcome metric found.</w:t>
             </w:r>
           </w:p>
         </w:tc>
@@ -1347,7 +1347,7 @@
           <w:i/>
           <w:sz w:val="18"/>
         </w:rPr>
-        <w:t xml:space="preserve">Zepto's updated draft prospectus, BigBasket (Tata Digital) and Flipkart's supply-chain planning paper are still to be read in full; the table will be updated as they are.</w:t>
+        <w:t>Zepto's updated draft prospectus, BigBasket (Tata Digital) and Flipkart's supply-chain planning paper are still to be read in full; the table will be updated as they are. The Eternal, Swiggy, Ocado, Tesco, Ahold, Spencer's, DMart, Trent and More Retail figures above were re-checked against the extracted source text on 7 Oct 2026; Reliance's annual report retail page was seen only through a summary.</w:t>
       </w:r>
     </w:p>
     <w:p>
@@ -1456,7 +1456,7 @@
     </w:p>
     <w:p>
       <w:r>
-        <w:t xml:space="preserve">Each will be written up with data needed, risks, regulatory fit (FSSAI, FDI rules on inventory, DPDP) and how it would be measured.</w:t>
+        <w:t>Each will be written up with data needed, risks, regulatory fit and how it would be measured. The regulatory screen will be read from primary text and covers FSSAI dark-store and food-safety rules, FDI rules on marketplace inventory and the IOCC route, CCI cost-of-production regulations, the DPDP Rules (notified 14 Nov 2025, with the main obligations from 13 May 2027, per law-firm summaries still to be checked on the MeitY text), the CCPA dark-pattern guidelines that quick-commerce platforms self-certified against in 2025, the Consumer Protection (E-Commerce) Rules 2020 and Legal Metrology.</w:t>
       </w:r>
     </w:p>
     <w:p>
@@ -2261,6 +2261,15 @@
         <w:spacing w:after="40"/>
       </w:pPr>
       <w:r>
+        <w:t>Public evidence here is thinner than for the lending alternative I compared earlier (about 66 against 81 out of 100 on the same weighted scorecard), so the study treats the disclosure gap as a finding and adds practitioner interviews as primary data.</w:t>
+      </w:r>
+    </w:p>
+    <w:p>
+      <w:pPr>
+        <w:pStyle w:val="ListBullet"/>
+        <w:spacing w:after="40"/>
+      </w:pPr>
+      <w:r>
         <w:t xml:space="preserve">Question 1: because filings give activity and plans more than outcomes, is a study built on disclosed metrics, a gap analysis and a few practitioner interviews acceptable, or are quantified before-and-after outcomes expected for every stage?</w:t>
       </w:r>
     </w:p>

</xml_diff>